<commit_message>
docs: add final archive guides
</commit_message>
<xml_diff>
--- a/docx/final/15_确认测试报告.docx
+++ b/docx/final/15_确认测试报告.docx
@@ -1012,7 +1012,7 @@
           <w:rFonts w:ascii="宋体" w:hAnsi="宋体" w:eastAsia="宋体"/>
           <w:color w:val="000000"/>
         </w:rPr>
-        <w:t xml:space="preserve">AGENTS.md</w:t>
+        <w:t xml:space="preserve">docx/final/md/13_单元测试报告.md</w:t>
       </w:r>
     </w:p>
     <w:p>
@@ -1031,7 +1031,45 @@
           <w:rFonts w:ascii="宋体" w:hAnsi="宋体" w:eastAsia="宋体"/>
           <w:color w:val="000000"/>
         </w:rPr>
+        <w:t xml:space="preserve">docx/final/md/14_集成测试报告.md</w:t>
+      </w:r>
+    </w:p>
+    <w:p>
+      <w:pPr>
+        <w:numPr>
+          <w:ilvl w:val="0"/>
+          <w:numId w:val="1001"/>
+        </w:numPr>
+        <w:pStyle w:val="Compact"/>
+        <w:spacing w:line="276" w:lineRule="auto" w:after="0"/>
+        <w:ind w:firstLine="420"/>
+      </w:pPr>
+      <w:r>
+        <w:rPr>
+          <w:rStyle w:val="VerbatimChar"/>
+          <w:rFonts w:ascii="宋体" w:hAnsi="宋体" w:eastAsia="宋体"/>
+          <w:color w:val="000000"/>
+        </w:rPr>
         <w:t xml:space="preserve">docs/工程实践各阶段要求.pdf</w:t>
+      </w:r>
+    </w:p>
+    <w:p>
+      <w:pPr>
+        <w:numPr>
+          <w:ilvl w:val="0"/>
+          <w:numId w:val="1001"/>
+        </w:numPr>
+        <w:pStyle w:val="Compact"/>
+        <w:spacing w:line="276" w:lineRule="auto" w:after="0"/>
+        <w:ind w:firstLine="420"/>
+      </w:pPr>
+      <w:r>
+        <w:rPr>
+          <w:rStyle w:val="VerbatimChar"/>
+          <w:rFonts w:ascii="宋体" w:hAnsi="宋体" w:eastAsia="宋体"/>
+          <w:color w:val="000000"/>
+        </w:rPr>
+        <w:t xml:space="preserve">docs/FINAL_DELIVERABLE_CHECKLIST.md</w:t>
       </w:r>
     </w:p>
     <w:bookmarkEnd w:id="22"/>
@@ -1720,7 +1758,7 @@
           <w:rFonts w:ascii="宋体" w:hAnsi="宋体" w:eastAsia="宋体"/>
           <w:color w:val="000000"/>
         </w:rPr>
-        <w:t xml:space="preserve">导出 Markdown 对应 PDF 和 DOCX，最终保留 22 份 Markdown、22 份 PDF、22 份 DOCX。</w:t>
+        <w:t xml:space="preserve">导出 Markdown 对应 PDF 和 DOCX。结题阶段保留 16 份 Markdown、PDF 和 DOCX，三阶段课程文档合计 27 份 Markdown、PDF 和 DOCX。</w:t>
       </w:r>
     </w:p>
     <w:bookmarkEnd w:id="24"/>

</xml_diff>